<commit_message>
Merge origin/main into lebo-github-docs
</commit_message>
<xml_diff>
--- a/resources/CampusGuard_Written_Doc.docx
+++ b/resources/CampusGuard_Written_Doc.docx
@@ -6,6 +6,7 @@
       <w:pPr>
         <w:pStyle w:val="Title"/>
         <w:spacing w:after="80"/>
+        <w:ind w:firstLine="720"/>
         <w:rPr>
           <w:rFonts w:ascii="Arial" w:hAnsi="Arial" w:cs="Arial"/>
         </w:rPr>
@@ -88,12 +89,6 @@
         <w:gridCol w:w="5040"/>
       </w:tblGrid>
       <w:tr>
-        <w:tblPrEx>
-          <w:tblCellMar>
-            <w:top w:w="0" w:type="dxa"/>
-            <w:bottom w:w="0" w:type="dxa"/>
-          </w:tblCellMar>
-        </w:tblPrEx>
         <w:trPr>
           <w:tblHeader/>
         </w:trPr>
@@ -155,12 +150,6 @@
         </w:tc>
       </w:tr>
       <w:tr>
-        <w:tblPrEx>
-          <w:tblCellMar>
-            <w:top w:w="0" w:type="dxa"/>
-            <w:bottom w:w="0" w:type="dxa"/>
-          </w:tblCellMar>
-        </w:tblPrEx>
         <w:tc>
           <w:tcPr>
             <w:tcW w:w="5040" w:type="dxa"/>
@@ -211,12 +200,6 @@
         </w:tc>
       </w:tr>
       <w:tr>
-        <w:tblPrEx>
-          <w:tblCellMar>
-            <w:top w:w="0" w:type="dxa"/>
-            <w:bottom w:w="0" w:type="dxa"/>
-          </w:tblCellMar>
-        </w:tblPrEx>
         <w:tc>
           <w:tcPr>
             <w:tcW w:w="5040" w:type="dxa"/>
@@ -273,12 +256,6 @@
         </w:tc>
       </w:tr>
       <w:tr>
-        <w:tblPrEx>
-          <w:tblCellMar>
-            <w:top w:w="0" w:type="dxa"/>
-            <w:bottom w:w="0" w:type="dxa"/>
-          </w:tblCellMar>
-        </w:tblPrEx>
         <w:tc>
           <w:tcPr>
             <w:tcW w:w="5040" w:type="dxa"/>
@@ -737,12 +714,6 @@
         <w:gridCol w:w="7200"/>
       </w:tblGrid>
       <w:tr>
-        <w:tblPrEx>
-          <w:tblCellMar>
-            <w:top w:w="0" w:type="dxa"/>
-            <w:bottom w:w="0" w:type="dxa"/>
-          </w:tblCellMar>
-        </w:tblPrEx>
         <w:trPr>
           <w:tblHeader/>
         </w:trPr>
@@ -826,12 +797,6 @@
         </w:tc>
       </w:tr>
       <w:tr>
-        <w:tblPrEx>
-          <w:tblCellMar>
-            <w:top w:w="0" w:type="dxa"/>
-            <w:bottom w:w="0" w:type="dxa"/>
-          </w:tblCellMar>
-        </w:tblPrEx>
         <w:tc>
           <w:tcPr>
             <w:tcW w:w="2880" w:type="dxa"/>
@@ -882,12 +847,6 @@
         </w:tc>
       </w:tr>
       <w:tr>
-        <w:tblPrEx>
-          <w:tblCellMar>
-            <w:top w:w="0" w:type="dxa"/>
-            <w:bottom w:w="0" w:type="dxa"/>
-          </w:tblCellMar>
-        </w:tblPrEx>
         <w:tc>
           <w:tcPr>
             <w:tcW w:w="2880" w:type="dxa"/>
@@ -984,12 +943,6 @@
         </w:tc>
       </w:tr>
       <w:tr>
-        <w:tblPrEx>
-          <w:tblCellMar>
-            <w:top w:w="0" w:type="dxa"/>
-            <w:bottom w:w="0" w:type="dxa"/>
-          </w:tblCellMar>
-        </w:tblPrEx>
         <w:tc>
           <w:tcPr>
             <w:tcW w:w="2880" w:type="dxa"/>
@@ -1042,12 +995,6 @@
         </w:tc>
       </w:tr>
       <w:tr>
-        <w:tblPrEx>
-          <w:tblCellMar>
-            <w:top w:w="0" w:type="dxa"/>
-            <w:bottom w:w="0" w:type="dxa"/>
-          </w:tblCellMar>
-        </w:tblPrEx>
         <w:tc>
           <w:tcPr>
             <w:tcW w:w="2880" w:type="dxa"/>
@@ -1170,12 +1117,6 @@
         </w:tc>
       </w:tr>
       <w:tr>
-        <w:tblPrEx>
-          <w:tblCellMar>
-            <w:top w:w="0" w:type="dxa"/>
-            <w:bottom w:w="0" w:type="dxa"/>
-          </w:tblCellMar>
-        </w:tblPrEx>
         <w:tc>
           <w:tcPr>
             <w:tcW w:w="2880" w:type="dxa"/>
@@ -1281,21 +1222,7 @@
         <w:rPr>
           <w:rFonts w:ascii="Arial" w:hAnsi="Arial" w:cs="Arial"/>
         </w:rPr>
-        <w:t xml:space="preserve"> stores executed commands and can call </w:t>
-      </w:r>
-      <w:proofErr w:type="gramStart"/>
-      <w:r>
-        <w:rPr>
-          <w:rFonts w:ascii="Arial" w:hAnsi="Arial" w:cs="Arial"/>
-        </w:rPr>
-        <w:t>undo(</w:t>
-      </w:r>
-      <w:proofErr w:type="gramEnd"/>
-      <w:r>
-        <w:rPr>
-          <w:rFonts w:ascii="Arial" w:hAnsi="Arial" w:cs="Arial"/>
-        </w:rPr>
-        <w:t>) on the most recent one, which decouples the object that requests an action from the objects that know how to perform and reverse it.</w:t>
+        <w:t xml:space="preserve"> stores executed commands and can call undo() on the most recent one, which decouples the object that requests an action from the objects that know how to perform and reverse it.</w:t>
       </w:r>
     </w:p>
     <w:p>
@@ -1335,12 +1262,6 @@
         <w:gridCol w:w="7200"/>
       </w:tblGrid>
       <w:tr>
-        <w:tblPrEx>
-          <w:tblCellMar>
-            <w:top w:w="0" w:type="dxa"/>
-            <w:bottom w:w="0" w:type="dxa"/>
-          </w:tblCellMar>
-        </w:tblPrEx>
         <w:trPr>
           <w:tblHeader/>
         </w:trPr>
@@ -1424,12 +1345,6 @@
         </w:tc>
       </w:tr>
       <w:tr>
-        <w:tblPrEx>
-          <w:tblCellMar>
-            <w:top w:w="0" w:type="dxa"/>
-            <w:bottom w:w="0" w:type="dxa"/>
-          </w:tblCellMar>
-        </w:tblPrEx>
         <w:tc>
           <w:tcPr>
             <w:tcW w:w="2880" w:type="dxa"/>
@@ -1488,12 +1403,6 @@
         </w:tc>
       </w:tr>
       <w:tr>
-        <w:tblPrEx>
-          <w:tblCellMar>
-            <w:top w:w="0" w:type="dxa"/>
-            <w:bottom w:w="0" w:type="dxa"/>
-          </w:tblCellMar>
-        </w:tblPrEx>
         <w:tc>
           <w:tcPr>
             <w:tcW w:w="2880" w:type="dxa"/>
@@ -1548,12 +1457,6 @@
         </w:tc>
       </w:tr>
       <w:tr>
-        <w:tblPrEx>
-          <w:tblCellMar>
-            <w:top w:w="0" w:type="dxa"/>
-            <w:bottom w:w="0" w:type="dxa"/>
-          </w:tblCellMar>
-        </w:tblPrEx>
         <w:tc>
           <w:tcPr>
             <w:tcW w:w="2880" w:type="dxa"/>
@@ -1612,12 +1515,6 @@
         </w:tc>
       </w:tr>
       <w:tr>
-        <w:tblPrEx>
-          <w:tblCellMar>
-            <w:top w:w="0" w:type="dxa"/>
-            <w:bottom w:w="0" w:type="dxa"/>
-          </w:tblCellMar>
-        </w:tblPrEx>
         <w:tc>
           <w:tcPr>
             <w:tcW w:w="2880" w:type="dxa"/>
@@ -1748,21 +1645,7 @@
         <w:rPr>
           <w:rFonts w:ascii="Arial" w:hAnsi="Arial" w:cs="Arial"/>
         </w:rPr>
-        <w:t xml:space="preserve"> it calls </w:t>
-      </w:r>
-      <w:proofErr w:type="gramStart"/>
-      <w:r>
-        <w:rPr>
-          <w:rFonts w:ascii="Arial" w:hAnsi="Arial" w:cs="Arial"/>
-        </w:rPr>
-        <w:t>notify(</w:t>
-      </w:r>
-      <w:proofErr w:type="gramEnd"/>
-      <w:r>
-        <w:rPr>
-          <w:rFonts w:ascii="Arial" w:hAnsi="Arial" w:cs="Arial"/>
-        </w:rPr>
-        <w:t xml:space="preserve">) on its </w:t>
+        <w:t xml:space="preserve"> it calls notify() on its </w:t>
       </w:r>
       <w:proofErr w:type="spellStart"/>
       <w:r>
@@ -1872,12 +1755,6 @@
         <w:gridCol w:w="7200"/>
       </w:tblGrid>
       <w:tr>
-        <w:tblPrEx>
-          <w:tblCellMar>
-            <w:top w:w="0" w:type="dxa"/>
-            <w:bottom w:w="0" w:type="dxa"/>
-          </w:tblCellMar>
-        </w:tblPrEx>
         <w:trPr>
           <w:tblHeader/>
         </w:trPr>
@@ -1961,12 +1838,6 @@
         </w:tc>
       </w:tr>
       <w:tr>
-        <w:tblPrEx>
-          <w:tblCellMar>
-            <w:top w:w="0" w:type="dxa"/>
-            <w:bottom w:w="0" w:type="dxa"/>
-          </w:tblCellMar>
-        </w:tblPrEx>
         <w:tc>
           <w:tcPr>
             <w:tcW w:w="2880" w:type="dxa"/>
@@ -2025,12 +1896,6 @@
         </w:tc>
       </w:tr>
       <w:tr>
-        <w:tblPrEx>
-          <w:tblCellMar>
-            <w:top w:w="0" w:type="dxa"/>
-            <w:bottom w:w="0" w:type="dxa"/>
-          </w:tblCellMar>
-        </w:tblPrEx>
         <w:tc>
           <w:tcPr>
             <w:tcW w:w="2880" w:type="dxa"/>
@@ -2085,12 +1950,6 @@
         </w:tc>
       </w:tr>
       <w:tr>
-        <w:tblPrEx>
-          <w:tblCellMar>
-            <w:top w:w="0" w:type="dxa"/>
-            <w:bottom w:w="0" w:type="dxa"/>
-          </w:tblCellMar>
-        </w:tblPrEx>
         <w:tc>
           <w:tcPr>
             <w:tcW w:w="2880" w:type="dxa"/>
@@ -2143,12 +2002,6 @@
         </w:tc>
       </w:tr>
       <w:tr>
-        <w:tblPrEx>
-          <w:tblCellMar>
-            <w:top w:w="0" w:type="dxa"/>
-            <w:bottom w:w="0" w:type="dxa"/>
-          </w:tblCellMar>
-        </w:tblPrEx>
         <w:tc>
           <w:tcPr>
             <w:tcW w:w="2880" w:type="dxa"/>
@@ -2245,7 +2098,6 @@
         <w:t xml:space="preserve"> exposes </w:t>
       </w:r>
       <w:proofErr w:type="spellStart"/>
-      <w:proofErr w:type="gramStart"/>
       <w:r>
         <w:rPr>
           <w:rFonts w:ascii="Arial" w:hAnsi="Arial" w:cs="Arial"/>
@@ -2257,14 +2109,7 @@
         <w:rPr>
           <w:rFonts w:ascii="Arial" w:hAnsi="Arial" w:cs="Arial"/>
         </w:rPr>
-        <w:t>(</w:t>
-      </w:r>
-      <w:proofErr w:type="gramEnd"/>
-      <w:r>
-        <w:rPr>
-          <w:rFonts w:ascii="Arial" w:hAnsi="Arial" w:cs="Arial"/>
-        </w:rPr>
-        <w:t xml:space="preserve">code, text, </w:t>
+        <w:t xml:space="preserve">(code, text, </w:t>
       </w:r>
       <w:proofErr w:type="spellStart"/>
       <w:r>
@@ -2281,7 +2126,6 @@
         <w:t xml:space="preserve">), a signature that does not match the </w:t>
       </w:r>
       <w:proofErr w:type="spellStart"/>
-      <w:proofErr w:type="gramStart"/>
       <w:r>
         <w:rPr>
           <w:rFonts w:ascii="Arial" w:hAnsi="Arial" w:cs="Arial"/>
@@ -2293,14 +2137,7 @@
         <w:rPr>
           <w:rFonts w:ascii="Arial" w:hAnsi="Arial" w:cs="Arial"/>
         </w:rPr>
-        <w:t>(</w:t>
-      </w:r>
-      <w:proofErr w:type="gramEnd"/>
-      <w:r>
-        <w:rPr>
-          <w:rFonts w:ascii="Arial" w:hAnsi="Arial" w:cs="Arial"/>
-        </w:rPr>
-        <w:t xml:space="preserve">message, level) interface </w:t>
+        <w:t xml:space="preserve">(message, level) interface </w:t>
       </w:r>
       <w:proofErr w:type="spellStart"/>
       <w:r>
@@ -2396,12 +2233,6 @@
         <w:gridCol w:w="7200"/>
       </w:tblGrid>
       <w:tr>
-        <w:tblPrEx>
-          <w:tblCellMar>
-            <w:top w:w="0" w:type="dxa"/>
-            <w:bottom w:w="0" w:type="dxa"/>
-          </w:tblCellMar>
-        </w:tblPrEx>
         <w:trPr>
           <w:tblHeader/>
         </w:trPr>
@@ -2485,12 +2316,6 @@
         </w:tc>
       </w:tr>
       <w:tr>
-        <w:tblPrEx>
-          <w:tblCellMar>
-            <w:top w:w="0" w:type="dxa"/>
-            <w:bottom w:w="0" w:type="dxa"/>
-          </w:tblCellMar>
-        </w:tblPrEx>
         <w:tc>
           <w:tcPr>
             <w:tcW w:w="2880" w:type="dxa"/>
@@ -2543,12 +2368,6 @@
         </w:tc>
       </w:tr>
       <w:tr>
-        <w:tblPrEx>
-          <w:tblCellMar>
-            <w:top w:w="0" w:type="dxa"/>
-            <w:bottom w:w="0" w:type="dxa"/>
-          </w:tblCellMar>
-        </w:tblPrEx>
         <w:tc>
           <w:tcPr>
             <w:tcW w:w="2880" w:type="dxa"/>
@@ -2649,12 +2468,6 @@
         </w:tc>
       </w:tr>
       <w:tr>
-        <w:tblPrEx>
-          <w:tblCellMar>
-            <w:top w:w="0" w:type="dxa"/>
-            <w:bottom w:w="0" w:type="dxa"/>
-          </w:tblCellMar>
-        </w:tblPrEx>
         <w:tc>
           <w:tcPr>
             <w:tcW w:w="2880" w:type="dxa"/>
@@ -2837,12 +2650,6 @@
         <w:gridCol w:w="7200"/>
       </w:tblGrid>
       <w:tr>
-        <w:tblPrEx>
-          <w:tblCellMar>
-            <w:top w:w="0" w:type="dxa"/>
-            <w:bottom w:w="0" w:type="dxa"/>
-          </w:tblCellMar>
-        </w:tblPrEx>
         <w:trPr>
           <w:tblHeader/>
         </w:trPr>
@@ -2926,12 +2733,6 @@
         </w:tc>
       </w:tr>
       <w:tr>
-        <w:tblPrEx>
-          <w:tblCellMar>
-            <w:top w:w="0" w:type="dxa"/>
-            <w:bottom w:w="0" w:type="dxa"/>
-          </w:tblCellMar>
-        </w:tblPrEx>
         <w:tc>
           <w:tcPr>
             <w:tcW w:w="2880" w:type="dxa"/>
@@ -2982,12 +2783,6 @@
         </w:tc>
       </w:tr>
       <w:tr>
-        <w:tblPrEx>
-          <w:tblCellMar>
-            <w:top w:w="0" w:type="dxa"/>
-            <w:bottom w:w="0" w:type="dxa"/>
-          </w:tblCellMar>
-        </w:tblPrEx>
         <w:tc>
           <w:tcPr>
             <w:tcW w:w="2880" w:type="dxa"/>
@@ -3046,12 +2841,6 @@
         </w:tc>
       </w:tr>
       <w:tr>
-        <w:tblPrEx>
-          <w:tblCellMar>
-            <w:top w:w="0" w:type="dxa"/>
-            <w:bottom w:w="0" w:type="dxa"/>
-          </w:tblCellMar>
-        </w:tblPrEx>
         <w:tc>
           <w:tcPr>
             <w:tcW w:w="2880" w:type="dxa"/>
@@ -3376,12 +3165,6 @@
         <w:gridCol w:w="7200"/>
       </w:tblGrid>
       <w:tr>
-        <w:tblPrEx>
-          <w:tblCellMar>
-            <w:top w:w="0" w:type="dxa"/>
-            <w:bottom w:w="0" w:type="dxa"/>
-          </w:tblCellMar>
-        </w:tblPrEx>
         <w:trPr>
           <w:tblHeader/>
         </w:trPr>
@@ -3465,12 +3248,6 @@
         </w:tc>
       </w:tr>
       <w:tr>
-        <w:tblPrEx>
-          <w:tblCellMar>
-            <w:top w:w="0" w:type="dxa"/>
-            <w:bottom w:w="0" w:type="dxa"/>
-          </w:tblCellMar>
-        </w:tblPrEx>
         <w:tc>
           <w:tcPr>
             <w:tcW w:w="2880" w:type="dxa"/>
@@ -3529,12 +3306,6 @@
         </w:tc>
       </w:tr>
       <w:tr>
-        <w:tblPrEx>
-          <w:tblCellMar>
-            <w:top w:w="0" w:type="dxa"/>
-            <w:bottom w:w="0" w:type="dxa"/>
-          </w:tblCellMar>
-        </w:tblPrEx>
         <w:tc>
           <w:tcPr>
             <w:tcW w:w="2880" w:type="dxa"/>
@@ -3585,12 +3356,6 @@
         </w:tc>
       </w:tr>
       <w:tr>
-        <w:tblPrEx>
-          <w:tblCellMar>
-            <w:top w:w="0" w:type="dxa"/>
-            <w:bottom w:w="0" w:type="dxa"/>
-          </w:tblCellMar>
-        </w:tblPrEx>
         <w:tc>
           <w:tcPr>
             <w:tcW w:w="2880" w:type="dxa"/>
@@ -3663,12 +3428,6 @@
         </w:tc>
       </w:tr>
       <w:tr>
-        <w:tblPrEx>
-          <w:tblCellMar>
-            <w:top w:w="0" w:type="dxa"/>
-            <w:bottom w:w="0" w:type="dxa"/>
-          </w:tblCellMar>
-        </w:tblPrEx>
         <w:tc>
           <w:tcPr>
             <w:tcW w:w="2880" w:type="dxa"/>
@@ -3782,49 +3541,7 @@
         <w:rPr>
           <w:rFonts w:ascii="Arial" w:hAnsi="Arial" w:cs="Arial"/>
         </w:rPr>
-        <w:t xml:space="preserve"> interface (</w:t>
-      </w:r>
-      <w:proofErr w:type="gramStart"/>
-      <w:r>
-        <w:rPr>
-          <w:rFonts w:ascii="Arial" w:hAnsi="Arial" w:cs="Arial"/>
-        </w:rPr>
-        <w:t>lock(</w:t>
-      </w:r>
-      <w:proofErr w:type="gramEnd"/>
-      <w:r>
-        <w:rPr>
-          <w:rFonts w:ascii="Arial" w:hAnsi="Arial" w:cs="Arial"/>
-        </w:rPr>
-        <w:t xml:space="preserve">), </w:t>
-      </w:r>
-      <w:proofErr w:type="gramStart"/>
-      <w:r>
-        <w:rPr>
-          <w:rFonts w:ascii="Arial" w:hAnsi="Arial" w:cs="Arial"/>
-        </w:rPr>
-        <w:t>unlock(</w:t>
-      </w:r>
-      <w:proofErr w:type="gramEnd"/>
-      <w:r>
-        <w:rPr>
-          <w:rFonts w:ascii="Arial" w:hAnsi="Arial" w:cs="Arial"/>
-        </w:rPr>
-        <w:t xml:space="preserve">), </w:t>
-      </w:r>
-      <w:proofErr w:type="gramStart"/>
-      <w:r>
-        <w:rPr>
-          <w:rFonts w:ascii="Arial" w:hAnsi="Arial" w:cs="Arial"/>
-        </w:rPr>
-        <w:t>restrict(</w:t>
-      </w:r>
-      <w:proofErr w:type="gramEnd"/>
-      <w:r>
-        <w:rPr>
-          <w:rFonts w:ascii="Arial" w:hAnsi="Arial" w:cs="Arial"/>
-        </w:rPr>
-        <w:t xml:space="preserve">)), so a </w:t>
+        <w:t xml:space="preserve"> interface (lock(), unlock(), restrict()), so a </w:t>
       </w:r>
       <w:proofErr w:type="spellStart"/>
       <w:r>
@@ -3838,21 +3555,7 @@
         <w:rPr>
           <w:rFonts w:ascii="Arial" w:hAnsi="Arial" w:cs="Arial"/>
         </w:rPr>
-        <w:t xml:space="preserve"> or the Facade can call </w:t>
-      </w:r>
-      <w:proofErr w:type="gramStart"/>
-      <w:r>
-        <w:rPr>
-          <w:rFonts w:ascii="Arial" w:hAnsi="Arial" w:cs="Arial"/>
-        </w:rPr>
-        <w:t>lock(</w:t>
-      </w:r>
-      <w:proofErr w:type="gramEnd"/>
-      <w:r>
-        <w:rPr>
-          <w:rFonts w:ascii="Arial" w:hAnsi="Arial" w:cs="Arial"/>
-        </w:rPr>
-        <w:t xml:space="preserve">) on any node in the tree without knowing whether it is a leaf or a group; </w:t>
+        <w:t xml:space="preserve"> or the Facade can call lock() on any node in the tree without knowing whether it is a leaf or a group; </w:t>
       </w:r>
       <w:proofErr w:type="spellStart"/>
       <w:r>
@@ -3894,21 +3597,7 @@
         <w:rPr>
           <w:rFonts w:ascii="Arial" w:hAnsi="Arial" w:cs="Arial"/>
         </w:rPr>
-        <w:t xml:space="preserve">() calls </w:t>
-      </w:r>
-      <w:proofErr w:type="gramStart"/>
-      <w:r>
-        <w:rPr>
-          <w:rFonts w:ascii="Arial" w:hAnsi="Arial" w:cs="Arial"/>
-        </w:rPr>
-        <w:t>lock(</w:t>
-      </w:r>
-      <w:proofErr w:type="gramEnd"/>
-      <w:r>
-        <w:rPr>
-          <w:rFonts w:ascii="Arial" w:hAnsi="Arial" w:cs="Arial"/>
-        </w:rPr>
-        <w:t xml:space="preserve">) once on the top-level </w:t>
+        <w:t xml:space="preserve">() calls lock() once on the top-level </w:t>
       </w:r>
       <w:proofErr w:type="spellStart"/>
       <w:r>
@@ -3922,7 +3611,33 @@
         <w:rPr>
           <w:rFonts w:ascii="Arial" w:hAnsi="Arial" w:cs="Arial"/>
         </w:rPr>
-        <w:t xml:space="preserve"> representing the affected building, which recursively locks every floor and room beneath it as part of the same multi-step facade operation that also involves the Mediator, the State-driven Incident, and the Adapter.</w:t>
+        <w:t xml:space="preserve"> representing the affected </w:t>
+      </w:r>
+      <w:proofErr w:type="spellStart"/>
+      <w:r>
+        <w:rPr>
+          <w:rFonts w:ascii="Arial" w:hAnsi="Arial" w:cs="Arial"/>
+        </w:rPr>
+        <w:t>build</w:t>
+      </w:r>
+      <w:r>
+        <w:rPr>
+          <w:rFonts w:ascii="Arial" w:hAnsi="Arial" w:cs="Arial"/>
+        </w:rPr>
+        <w:t>r</w:t>
+      </w:r>
+      <w:r>
+        <w:rPr>
+          <w:rFonts w:ascii="Arial" w:hAnsi="Arial" w:cs="Arial"/>
+        </w:rPr>
+        <w:t>ing</w:t>
+      </w:r>
+      <w:proofErr w:type="spellEnd"/>
+      <w:r>
+        <w:rPr>
+          <w:rFonts w:ascii="Arial" w:hAnsi="Arial" w:cs="Arial"/>
+        </w:rPr>
+        <w:t>, which recursively locks every floor and room beneath it as part of the same multi-step facade operation that also involves the Mediator, the State-driven Incident, and the Adapter.</w:t>
       </w:r>
     </w:p>
     <w:p>
@@ -3979,12 +3694,6 @@
         <w:gridCol w:w="1931"/>
       </w:tblGrid>
       <w:tr>
-        <w:tblPrEx>
-          <w:tblCellMar>
-            <w:top w:w="0" w:type="dxa"/>
-            <w:bottom w:w="0" w:type="dxa"/>
-          </w:tblCellMar>
-        </w:tblPrEx>
         <w:trPr>
           <w:tblHeader/>
         </w:trPr>
@@ -4096,9 +3805,27 @@
                 <w:bCs/>
                 <w:color w:val="FFFFFF"/>
               </w:rPr>
-              <w:t>Multiplicity (</w:t>
-            </w:r>
-            <w:proofErr w:type="gramStart"/>
+              <w:t>Multiplicity (From : To)</w:t>
+            </w:r>
+          </w:p>
+        </w:tc>
+        <w:tc>
+          <w:tcPr>
+            <w:tcW w:w="2735" w:type="dxa"/>
+            <w:shd w:val="clear" w:color="auto" w:fill="2E4057"/>
+            <w:tcMar>
+              <w:top w:w="80" w:type="dxa"/>
+              <w:left w:w="100" w:type="dxa"/>
+              <w:bottom w:w="80" w:type="dxa"/>
+              <w:right w:w="100" w:type="dxa"/>
+            </w:tcMar>
+          </w:tcPr>
+          <w:p>
+            <w:pPr>
+              <w:rPr>
+                <w:rFonts w:ascii="Arial" w:hAnsi="Arial" w:cs="Arial"/>
+              </w:rPr>
+            </w:pPr>
             <w:r>
               <w:rPr>
                 <w:rFonts w:ascii="Arial" w:hAnsi="Arial" w:cs="Arial"/>
@@ -4106,56 +3833,12 @@
                 <w:bCs/>
                 <w:color w:val="FFFFFF"/>
               </w:rPr>
-              <w:t>From :</w:t>
-            </w:r>
-            <w:proofErr w:type="gramEnd"/>
-            <w:r>
-              <w:rPr>
-                <w:rFonts w:ascii="Arial" w:hAnsi="Arial" w:cs="Arial"/>
-                <w:b/>
-                <w:bCs/>
-                <w:color w:val="FFFFFF"/>
-              </w:rPr>
-              <w:t xml:space="preserve"> To)</w:t>
-            </w:r>
-          </w:p>
-        </w:tc>
-        <w:tc>
-          <w:tcPr>
-            <w:tcW w:w="2735" w:type="dxa"/>
-            <w:shd w:val="clear" w:color="auto" w:fill="2E4057"/>
-            <w:tcMar>
-              <w:top w:w="80" w:type="dxa"/>
-              <w:left w:w="100" w:type="dxa"/>
-              <w:bottom w:w="80" w:type="dxa"/>
-              <w:right w:w="100" w:type="dxa"/>
-            </w:tcMar>
-          </w:tcPr>
-          <w:p>
-            <w:pPr>
-              <w:rPr>
-                <w:rFonts w:ascii="Arial" w:hAnsi="Arial" w:cs="Arial"/>
-              </w:rPr>
-            </w:pPr>
-            <w:r>
-              <w:rPr>
-                <w:rFonts w:ascii="Arial" w:hAnsi="Arial" w:cs="Arial"/>
-                <w:b/>
-                <w:bCs/>
-                <w:color w:val="FFFFFF"/>
-              </w:rPr>
               <w:t>Notes</w:t>
             </w:r>
           </w:p>
         </w:tc>
       </w:tr>
       <w:tr>
-        <w:tblPrEx>
-          <w:tblCellMar>
-            <w:top w:w="0" w:type="dxa"/>
-            <w:bottom w:w="0" w:type="dxa"/>
-          </w:tblCellMar>
-        </w:tblPrEx>
         <w:tc>
           <w:tcPr>
             <w:tcW w:w="2735" w:type="dxa"/>
@@ -4338,12 +4021,6 @@
         </w:tc>
       </w:tr>
       <w:tr>
-        <w:tblPrEx>
-          <w:tblCellMar>
-            <w:top w:w="0" w:type="dxa"/>
-            <w:bottom w:w="0" w:type="dxa"/>
-          </w:tblCellMar>
-        </w:tblPrEx>
         <w:tc>
           <w:tcPr>
             <w:tcW w:w="2735" w:type="dxa"/>
@@ -4434,19 +4111,11 @@
                 <w:rFonts w:ascii="Arial" w:hAnsi="Arial" w:cs="Arial"/>
               </w:rPr>
             </w:pPr>
-            <w:proofErr w:type="gramStart"/>
-            <w:r>
-              <w:rPr>
-                <w:rFonts w:ascii="Arial" w:hAnsi="Arial" w:cs="Arial"/>
-              </w:rPr>
-              <w:t>1 :</w:t>
-            </w:r>
-            <w:proofErr w:type="gramEnd"/>
-            <w:r>
-              <w:rPr>
-                <w:rFonts w:ascii="Arial" w:hAnsi="Arial" w:cs="Arial"/>
-              </w:rPr>
-              <w:t xml:space="preserve"> 1</w:t>
+            <w:r>
+              <w:rPr>
+                <w:rFonts w:ascii="Arial" w:hAnsi="Arial" w:cs="Arial"/>
+              </w:rPr>
+              <w:t>1 : 1</w:t>
             </w:r>
           </w:p>
         </w:tc>
@@ -4476,12 +4145,6 @@
         </w:tc>
       </w:tr>
       <w:tr>
-        <w:tblPrEx>
-          <w:tblCellMar>
-            <w:top w:w="0" w:type="dxa"/>
-            <w:bottom w:w="0" w:type="dxa"/>
-          </w:tblCellMar>
-        </w:tblPrEx>
         <w:tc>
           <w:tcPr>
             <w:tcW w:w="2735" w:type="dxa"/>
@@ -4606,12 +4269,6 @@
         </w:tc>
       </w:tr>
       <w:tr>
-        <w:tblPrEx>
-          <w:tblCellMar>
-            <w:top w:w="0" w:type="dxa"/>
-            <w:bottom w:w="0" w:type="dxa"/>
-          </w:tblCellMar>
-        </w:tblPrEx>
         <w:tc>
           <w:tcPr>
             <w:tcW w:w="2735" w:type="dxa"/>
@@ -4738,12 +4395,6 @@
         </w:tc>
       </w:tr>
       <w:tr>
-        <w:tblPrEx>
-          <w:tblCellMar>
-            <w:top w:w="0" w:type="dxa"/>
-            <w:bottom w:w="0" w:type="dxa"/>
-          </w:tblCellMar>
-        </w:tblPrEx>
         <w:tc>
           <w:tcPr>
             <w:tcW w:w="2735" w:type="dxa"/>
@@ -4836,33 +4487,11 @@
                 <w:rFonts w:ascii="Arial" w:hAnsi="Arial" w:cs="Arial"/>
               </w:rPr>
             </w:pPr>
-            <w:proofErr w:type="gramStart"/>
-            <w:r>
-              <w:rPr>
-                <w:rFonts w:ascii="Arial" w:hAnsi="Arial" w:cs="Arial"/>
-              </w:rPr>
-              <w:t>1 :</w:t>
-            </w:r>
-            <w:proofErr w:type="gramEnd"/>
-            <w:r>
-              <w:rPr>
-                <w:rFonts w:ascii="Arial" w:hAnsi="Arial" w:cs="Arial"/>
-              </w:rPr>
-              <w:t xml:space="preserve"> </w:t>
-            </w:r>
-            <w:proofErr w:type="gramStart"/>
-            <w:r>
-              <w:rPr>
-                <w:rFonts w:ascii="Arial" w:hAnsi="Arial" w:cs="Arial"/>
-              </w:rPr>
-              <w:t>0..</w:t>
-            </w:r>
-            <w:proofErr w:type="gramEnd"/>
-            <w:r>
-              <w:rPr>
-                <w:rFonts w:ascii="Arial" w:hAnsi="Arial" w:cs="Arial"/>
-              </w:rPr>
-              <w:t>*</w:t>
+            <w:r>
+              <w:rPr>
+                <w:rFonts w:ascii="Arial" w:hAnsi="Arial" w:cs="Arial"/>
+              </w:rPr>
+              <w:t>1 : 0..*</w:t>
             </w:r>
           </w:p>
         </w:tc>
@@ -4892,12 +4521,6 @@
         </w:tc>
       </w:tr>
       <w:tr>
-        <w:tblPrEx>
-          <w:tblCellMar>
-            <w:top w:w="0" w:type="dxa"/>
-            <w:bottom w:w="0" w:type="dxa"/>
-          </w:tblCellMar>
-        </w:tblPrEx>
         <w:tc>
           <w:tcPr>
             <w:tcW w:w="2735" w:type="dxa"/>
@@ -5073,12 +4696,6 @@
         </w:tc>
       </w:tr>
       <w:tr>
-        <w:tblPrEx>
-          <w:tblCellMar>
-            <w:top w:w="0" w:type="dxa"/>
-            <w:bottom w:w="0" w:type="dxa"/>
-          </w:tblCellMar>
-        </w:tblPrEx>
         <w:tc>
           <w:tcPr>
             <w:tcW w:w="2735" w:type="dxa"/>
@@ -5170,33 +4787,11 @@
                 <w:rFonts w:ascii="Arial" w:hAnsi="Arial" w:cs="Arial"/>
               </w:rPr>
             </w:pPr>
-            <w:proofErr w:type="gramStart"/>
-            <w:r>
-              <w:rPr>
-                <w:rFonts w:ascii="Arial" w:hAnsi="Arial" w:cs="Arial"/>
-              </w:rPr>
-              <w:t>1 :</w:t>
-            </w:r>
-            <w:proofErr w:type="gramEnd"/>
-            <w:r>
-              <w:rPr>
-                <w:rFonts w:ascii="Arial" w:hAnsi="Arial" w:cs="Arial"/>
-              </w:rPr>
-              <w:t xml:space="preserve"> </w:t>
-            </w:r>
-            <w:proofErr w:type="gramStart"/>
-            <w:r>
-              <w:rPr>
-                <w:rFonts w:ascii="Arial" w:hAnsi="Arial" w:cs="Arial"/>
-              </w:rPr>
-              <w:t>0..</w:t>
-            </w:r>
-            <w:proofErr w:type="gramEnd"/>
-            <w:r>
-              <w:rPr>
-                <w:rFonts w:ascii="Arial" w:hAnsi="Arial" w:cs="Arial"/>
-              </w:rPr>
-              <w:t>*</w:t>
+            <w:r>
+              <w:rPr>
+                <w:rFonts w:ascii="Arial" w:hAnsi="Arial" w:cs="Arial"/>
+              </w:rPr>
+              <w:t>1 : 0..*</w:t>
             </w:r>
           </w:p>
         </w:tc>
@@ -5226,12 +4821,6 @@
         </w:tc>
       </w:tr>
       <w:tr>
-        <w:tblPrEx>
-          <w:tblCellMar>
-            <w:top w:w="0" w:type="dxa"/>
-            <w:bottom w:w="0" w:type="dxa"/>
-          </w:tblCellMar>
-        </w:tblPrEx>
         <w:tc>
           <w:tcPr>
             <w:tcW w:w="2735" w:type="dxa"/>
@@ -5324,19 +4913,11 @@
                 <w:rFonts w:ascii="Arial" w:hAnsi="Arial" w:cs="Arial"/>
               </w:rPr>
             </w:pPr>
-            <w:proofErr w:type="gramStart"/>
-            <w:r>
-              <w:rPr>
-                <w:rFonts w:ascii="Arial" w:hAnsi="Arial" w:cs="Arial"/>
-              </w:rPr>
-              <w:t>1 :</w:t>
-            </w:r>
-            <w:proofErr w:type="gramEnd"/>
-            <w:r>
-              <w:rPr>
-                <w:rFonts w:ascii="Arial" w:hAnsi="Arial" w:cs="Arial"/>
-              </w:rPr>
-              <w:t xml:space="preserve"> 1</w:t>
+            <w:r>
+              <w:rPr>
+                <w:rFonts w:ascii="Arial" w:hAnsi="Arial" w:cs="Arial"/>
+              </w:rPr>
+              <w:t>1 : 1</w:t>
             </w:r>
           </w:p>
         </w:tc>
@@ -5366,12 +4947,6 @@
         </w:tc>
       </w:tr>
       <w:tr>
-        <w:tblPrEx>
-          <w:tblCellMar>
-            <w:top w:w="0" w:type="dxa"/>
-            <w:bottom w:w="0" w:type="dxa"/>
-          </w:tblCellMar>
-        </w:tblPrEx>
         <w:tc>
           <w:tcPr>
             <w:tcW w:w="2735" w:type="dxa"/>
@@ -5464,19 +5039,11 @@
                 <w:rFonts w:ascii="Arial" w:hAnsi="Arial" w:cs="Arial"/>
               </w:rPr>
             </w:pPr>
-            <w:proofErr w:type="gramStart"/>
-            <w:r>
-              <w:rPr>
-                <w:rFonts w:ascii="Arial" w:hAnsi="Arial" w:cs="Arial"/>
-              </w:rPr>
-              <w:t>1 :</w:t>
-            </w:r>
-            <w:proofErr w:type="gramEnd"/>
-            <w:r>
-              <w:rPr>
-                <w:rFonts w:ascii="Arial" w:hAnsi="Arial" w:cs="Arial"/>
-              </w:rPr>
-              <w:t xml:space="preserve"> 1</w:t>
+            <w:r>
+              <w:rPr>
+                <w:rFonts w:ascii="Arial" w:hAnsi="Arial" w:cs="Arial"/>
+              </w:rPr>
+              <w:t>1 : 1</w:t>
             </w:r>
           </w:p>
         </w:tc>
@@ -5506,12 +5073,6 @@
         </w:tc>
       </w:tr>
       <w:tr>
-        <w:tblPrEx>
-          <w:tblCellMar>
-            <w:top w:w="0" w:type="dxa"/>
-            <w:bottom w:w="0" w:type="dxa"/>
-          </w:tblCellMar>
-        </w:tblPrEx>
         <w:tc>
           <w:tcPr>
             <w:tcW w:w="2735" w:type="dxa"/>
@@ -5604,19 +5165,11 @@
                 <w:rFonts w:ascii="Arial" w:hAnsi="Arial" w:cs="Arial"/>
               </w:rPr>
             </w:pPr>
-            <w:proofErr w:type="gramStart"/>
-            <w:r>
-              <w:rPr>
-                <w:rFonts w:ascii="Arial" w:hAnsi="Arial" w:cs="Arial"/>
-              </w:rPr>
-              <w:t>1 :</w:t>
-            </w:r>
-            <w:proofErr w:type="gramEnd"/>
-            <w:r>
-              <w:rPr>
-                <w:rFonts w:ascii="Arial" w:hAnsi="Arial" w:cs="Arial"/>
-              </w:rPr>
-              <w:t xml:space="preserve"> 1</w:t>
+            <w:r>
+              <w:rPr>
+                <w:rFonts w:ascii="Arial" w:hAnsi="Arial" w:cs="Arial"/>
+              </w:rPr>
+              <w:t>1 : 1</w:t>
             </w:r>
           </w:p>
         </w:tc>
@@ -5646,12 +5199,6 @@
         </w:tc>
       </w:tr>
       <w:tr>
-        <w:tblPrEx>
-          <w:tblCellMar>
-            <w:top w:w="0" w:type="dxa"/>
-            <w:bottom w:w="0" w:type="dxa"/>
-          </w:tblCellMar>
-        </w:tblPrEx>
         <w:tc>
           <w:tcPr>
             <w:tcW w:w="2735" w:type="dxa"/>
@@ -5820,12 +5367,6 @@
         </w:tc>
       </w:tr>
       <w:tr>
-        <w:tblPrEx>
-          <w:tblCellMar>
-            <w:top w:w="0" w:type="dxa"/>
-            <w:bottom w:w="0" w:type="dxa"/>
-          </w:tblCellMar>
-        </w:tblPrEx>
         <w:tc>
           <w:tcPr>
             <w:tcW w:w="2735" w:type="dxa"/>
@@ -5952,12 +5493,6 @@
         </w:tc>
       </w:tr>
       <w:tr>
-        <w:tblPrEx>
-          <w:tblCellMar>
-            <w:top w:w="0" w:type="dxa"/>
-            <w:bottom w:w="0" w:type="dxa"/>
-          </w:tblCellMar>
-        </w:tblPrEx>
         <w:tc>
           <w:tcPr>
             <w:tcW w:w="2735" w:type="dxa"/>
@@ -6050,33 +5585,11 @@
                 <w:rFonts w:ascii="Arial" w:hAnsi="Arial" w:cs="Arial"/>
               </w:rPr>
             </w:pPr>
-            <w:proofErr w:type="gramStart"/>
-            <w:r>
-              <w:rPr>
-                <w:rFonts w:ascii="Arial" w:hAnsi="Arial" w:cs="Arial"/>
-              </w:rPr>
-              <w:t>1 :</w:t>
-            </w:r>
-            <w:proofErr w:type="gramEnd"/>
-            <w:r>
-              <w:rPr>
-                <w:rFonts w:ascii="Arial" w:hAnsi="Arial" w:cs="Arial"/>
-              </w:rPr>
-              <w:t xml:space="preserve"> </w:t>
-            </w:r>
-            <w:proofErr w:type="gramStart"/>
-            <w:r>
-              <w:rPr>
-                <w:rFonts w:ascii="Arial" w:hAnsi="Arial" w:cs="Arial"/>
-              </w:rPr>
-              <w:t>1..</w:t>
-            </w:r>
-            <w:proofErr w:type="gramEnd"/>
-            <w:r>
-              <w:rPr>
-                <w:rFonts w:ascii="Arial" w:hAnsi="Arial" w:cs="Arial"/>
-              </w:rPr>
-              <w:t>*</w:t>
+            <w:r>
+              <w:rPr>
+                <w:rFonts w:ascii="Arial" w:hAnsi="Arial" w:cs="Arial"/>
+              </w:rPr>
+              <w:t>1 : 1..*</w:t>
             </w:r>
           </w:p>
         </w:tc>
@@ -6106,12 +5619,6 @@
         </w:tc>
       </w:tr>
       <w:tr>
-        <w:tblPrEx>
-          <w:tblCellMar>
-            <w:top w:w="0" w:type="dxa"/>
-            <w:bottom w:w="0" w:type="dxa"/>
-          </w:tblCellMar>
-        </w:tblPrEx>
         <w:tc>
           <w:tcPr>
             <w:tcW w:w="2735" w:type="dxa"/>
@@ -6204,19 +5711,11 @@
                 <w:rFonts w:ascii="Arial" w:hAnsi="Arial" w:cs="Arial"/>
               </w:rPr>
             </w:pPr>
-            <w:proofErr w:type="gramStart"/>
-            <w:r>
-              <w:rPr>
-                <w:rFonts w:ascii="Arial" w:hAnsi="Arial" w:cs="Arial"/>
-              </w:rPr>
-              <w:t>0..*</w:t>
-            </w:r>
-            <w:proofErr w:type="gramEnd"/>
-            <w:r>
-              <w:rPr>
-                <w:rFonts w:ascii="Arial" w:hAnsi="Arial" w:cs="Arial"/>
-              </w:rPr>
-              <w:t xml:space="preserve"> : 1</w:t>
+            <w:r>
+              <w:rPr>
+                <w:rFonts w:ascii="Arial" w:hAnsi="Arial" w:cs="Arial"/>
+              </w:rPr>
+              <w:t>0..* : 1</w:t>
             </w:r>
           </w:p>
         </w:tc>
@@ -6246,12 +5745,6 @@
         </w:tc>
       </w:tr>
       <w:tr>
-        <w:tblPrEx>
-          <w:tblCellMar>
-            <w:top w:w="0" w:type="dxa"/>
-            <w:bottom w:w="0" w:type="dxa"/>
-          </w:tblCellMar>
-        </w:tblPrEx>
         <w:tc>
           <w:tcPr>
             <w:tcW w:w="2735" w:type="dxa"/>
@@ -6378,12 +5871,6 @@
         </w:tc>
       </w:tr>
       <w:tr>
-        <w:tblPrEx>
-          <w:tblCellMar>
-            <w:top w:w="0" w:type="dxa"/>
-            <w:bottom w:w="0" w:type="dxa"/>
-          </w:tblCellMar>
-        </w:tblPrEx>
         <w:tc>
           <w:tcPr>
             <w:tcW w:w="2735" w:type="dxa"/>
@@ -6476,19 +5963,11 @@
                 <w:rFonts w:ascii="Arial" w:hAnsi="Arial" w:cs="Arial"/>
               </w:rPr>
             </w:pPr>
-            <w:proofErr w:type="gramStart"/>
-            <w:r>
-              <w:rPr>
-                <w:rFonts w:ascii="Arial" w:hAnsi="Arial" w:cs="Arial"/>
-              </w:rPr>
-              <w:t>1 :</w:t>
-            </w:r>
-            <w:proofErr w:type="gramEnd"/>
-            <w:r>
-              <w:rPr>
-                <w:rFonts w:ascii="Arial" w:hAnsi="Arial" w:cs="Arial"/>
-              </w:rPr>
-              <w:t xml:space="preserve"> 1</w:t>
+            <w:r>
+              <w:rPr>
+                <w:rFonts w:ascii="Arial" w:hAnsi="Arial" w:cs="Arial"/>
+              </w:rPr>
+              <w:t>1 : 1</w:t>
             </w:r>
           </w:p>
         </w:tc>
@@ -6532,12 +6011,6 @@
         </w:tc>
       </w:tr>
       <w:tr>
-        <w:tblPrEx>
-          <w:tblCellMar>
-            <w:top w:w="0" w:type="dxa"/>
-            <w:bottom w:w="0" w:type="dxa"/>
-          </w:tblCellMar>
-        </w:tblPrEx>
         <w:tc>
           <w:tcPr>
             <w:tcW w:w="2735" w:type="dxa"/>
@@ -6630,19 +6103,11 @@
                 <w:rFonts w:ascii="Arial" w:hAnsi="Arial" w:cs="Arial"/>
               </w:rPr>
             </w:pPr>
-            <w:proofErr w:type="gramStart"/>
-            <w:r>
-              <w:rPr>
-                <w:rFonts w:ascii="Arial" w:hAnsi="Arial" w:cs="Arial"/>
-              </w:rPr>
-              <w:t>1 :</w:t>
-            </w:r>
-            <w:proofErr w:type="gramEnd"/>
-            <w:r>
-              <w:rPr>
-                <w:rFonts w:ascii="Arial" w:hAnsi="Arial" w:cs="Arial"/>
-              </w:rPr>
-              <w:t xml:space="preserve"> 1</w:t>
+            <w:r>
+              <w:rPr>
+                <w:rFonts w:ascii="Arial" w:hAnsi="Arial" w:cs="Arial"/>
+              </w:rPr>
+              <w:t>1 : 1</w:t>
             </w:r>
           </w:p>
         </w:tc>
@@ -6672,12 +6137,6 @@
         </w:tc>
       </w:tr>
       <w:tr>
-        <w:tblPrEx>
-          <w:tblCellMar>
-            <w:top w:w="0" w:type="dxa"/>
-            <w:bottom w:w="0" w:type="dxa"/>
-          </w:tblCellMar>
-        </w:tblPrEx>
         <w:tc>
           <w:tcPr>
             <w:tcW w:w="2735" w:type="dxa"/>
@@ -6799,32 +6258,12 @@
               <w:rPr>
                 <w:rFonts w:ascii="Arial" w:hAnsi="Arial" w:cs="Arial"/>
               </w:rPr>
-              <w:t>Facade calls lock()/</w:t>
-            </w:r>
-            <w:proofErr w:type="gramStart"/>
-            <w:r>
-              <w:rPr>
-                <w:rFonts w:ascii="Arial" w:hAnsi="Arial" w:cs="Arial"/>
-              </w:rPr>
-              <w:t>unlock(</w:t>
-            </w:r>
-            <w:proofErr w:type="gramEnd"/>
-            <w:r>
-              <w:rPr>
-                <w:rFonts w:ascii="Arial" w:hAnsi="Arial" w:cs="Arial"/>
-              </w:rPr>
-              <w:t>) on a referenced area tree</w:t>
+              <w:t>Facade calls lock()/unlock() on a referenced area tree</w:t>
             </w:r>
           </w:p>
         </w:tc>
       </w:tr>
       <w:tr>
-        <w:tblPrEx>
-          <w:tblCellMar>
-            <w:top w:w="0" w:type="dxa"/>
-            <w:bottom w:w="0" w:type="dxa"/>
-          </w:tblCellMar>
-        </w:tblPrEx>
         <w:tc>
           <w:tcPr>
             <w:tcW w:w="2735" w:type="dxa"/>
@@ -6951,12 +6390,6 @@
         </w:tc>
       </w:tr>
       <w:tr>
-        <w:tblPrEx>
-          <w:tblCellMar>
-            <w:top w:w="0" w:type="dxa"/>
-            <w:bottom w:w="0" w:type="dxa"/>
-          </w:tblCellMar>
-        </w:tblPrEx>
         <w:tc>
           <w:tcPr>
             <w:tcW w:w="2735" w:type="dxa"/>
@@ -7081,12 +6514,6 @@
         </w:tc>
       </w:tr>
       <w:tr>
-        <w:tblPrEx>
-          <w:tblCellMar>
-            <w:top w:w="0" w:type="dxa"/>
-            <w:bottom w:w="0" w:type="dxa"/>
-          </w:tblCellMar>
-        </w:tblPrEx>
         <w:tc>
           <w:tcPr>
             <w:tcW w:w="2735" w:type="dxa"/>
@@ -7302,7 +6729,6 @@
         <w:t xml:space="preserve"> children added to it and deletes them in ~</w:t>
       </w:r>
       <w:proofErr w:type="spellStart"/>
-      <w:proofErr w:type="gramStart"/>
       <w:r>
         <w:rPr>
           <w:rFonts w:ascii="Arial" w:hAnsi="Arial" w:cs="Arial"/>
@@ -7314,14 +6740,7 @@
         <w:rPr>
           <w:rFonts w:ascii="Arial" w:hAnsi="Arial" w:cs="Arial"/>
         </w:rPr>
-        <w:t>(</w:t>
-      </w:r>
-      <w:proofErr w:type="gramEnd"/>
-      <w:r>
-        <w:rPr>
-          <w:rFonts w:ascii="Arial" w:hAnsi="Arial" w:cs="Arial"/>
-        </w:rPr>
-        <w:t>).</w:t>
+        <w:t>().</w:t>
       </w:r>
     </w:p>
     <w:p>
@@ -7763,21 +7182,7 @@
         <w:rPr>
           <w:rFonts w:ascii="Arial" w:hAnsi="Arial" w:cs="Arial"/>
         </w:rPr>
-        <w:t xml:space="preserve">When an area must be secured, the command or the facade calls </w:t>
-      </w:r>
-      <w:proofErr w:type="gramStart"/>
-      <w:r>
-        <w:rPr>
-          <w:rFonts w:ascii="Arial" w:hAnsi="Arial" w:cs="Arial"/>
-        </w:rPr>
-        <w:t>lock(</w:t>
-      </w:r>
-      <w:proofErr w:type="gramEnd"/>
-      <w:r>
-        <w:rPr>
-          <w:rFonts w:ascii="Arial" w:hAnsi="Arial" w:cs="Arial"/>
-        </w:rPr>
-        <w:t xml:space="preserve">) on the relevant node of the </w:t>
+        <w:t xml:space="preserve">When an area must be secured, the command or the facade calls lock() on the relevant node of the </w:t>
       </w:r>
       <w:proofErr w:type="spellStart"/>
       <w:r>

</xml_diff>